<commit_message>
Resume v3: signature impact, JSON-driven site, public PDF
- Expand data/kelly_resume_source.json with eight punchy Signature Impact bullets and six outcome-focused OUSD bullets; strengthen Chapman evaluator language; confirm Riley Jun 2013-Mar 2016 and caseload-based supervision.
- Generate resume/kelly_resume_v2.md and resume/kelly_resume_v3.md plus outputs/ PDFs; publish public/resume.pdf for download.
- Wire SignatureImpact, ExperienceTimeline, and EducationBlock to @data/kelly_resume_source.json; fix Orange Unified wording and PDF download link.
- Update resume generator for in-repo public/ only; ignore out/ and node_modules/.

Made-with: Cursor
</commit_message>
<xml_diff>
--- a/outputs/executive_snapshot.docx
+++ b/outputs/executive_snapshot.docx
@@ -84,7 +84,7 @@
           <w:rFonts w:ascii="Calibri" w:hAnsi="Calibri"/>
           <w:sz w:val="22"/>
         </w:rPr>
-        <w:t>Chapman University Field Supervisor (Special Education &amp; Multiple Subject candidates): coaches and evaluates candidates during clinical practice and student teaching; supports CalTPA using the 13 TPEs; observes, conferences, and documents formative/summative feedback; collaborates with mentor teachers and program leadership; recommends completion readiness (approval/non-approval).</w:t>
+        <w:t>Evaluated and coached Chapman Special Education and Multiple Subject candidates—anchoring feedback to CalTPA and all 13 TPEs—and issued approval/non-approval program readiness calls on completion.</w:t>
       </w:r>
     </w:p>
     <w:p>
@@ -96,7 +96,7 @@
           <w:rFonts w:ascii="Calibri" w:hAnsi="Calibri"/>
           <w:sz w:val="22"/>
         </w:rPr>
-        <w:t>Mission Hills Christian School (Junior High English): supported a long-term shift from active reading avoidance to engagement across two school years; in high school the student independently chose novel-study coursework and credited the earlier confidence foundation as the reason they were willing to try.</w:t>
+        <w:t>Runs Orange USD (Olive) caseloads across SDC + RSP/Inclusion with MTSS/RTI and UDL, keeping mild/moderate services tight to measurable IEP goals and workable general education partnerships.</w:t>
       </w:r>
     </w:p>
     <w:p>
@@ -108,7 +108,7 @@
           <w:rFonts w:ascii="Calibri" w:hAnsi="Calibri"/>
           <w:sz w:val="22"/>
         </w:rPr>
-        <w:t>Chino Unified School District (Anna Borba Elementary): supported two students who had been labeled as behavior concerns through relationship-first check-ins, barrier reduction, and interest-based engagement; strengthened family–school partnership and long-horizon student trajectories (privacy-safe details only).</w:t>
+        <w:t>Mission Hills junior high English: moved a reluctant reader from avoidance to steady engagement over two years; the student later chose high school novel-study electives and pointed to this stretch as the turning point (privacy-safe).</w:t>
       </w:r>
     </w:p>
     <w:p>
@@ -120,7 +120,7 @@
           <w:rFonts w:ascii="Calibri" w:hAnsi="Calibri"/>
           <w:sz w:val="22"/>
         </w:rPr>
-        <w:t>Orange Unified School District (Olive Elementary): designs and delivers individualized, standards-based instruction for students with mild/moderate disabilities across SDC and RSP/Inclusion service models with MTSS/RTI and UDL-aligned practices.</w:t>
+        <w:t>Anna Borba (Chino USD): built trust with two students flagged as high-risk behavior concerns; engagement improved, families re-engaged at school after long gaps, and both students later described the steady support as formative (privacy-safe).</w:t>
       </w:r>
     </w:p>
     <w:p>
@@ -132,7 +132,7 @@
           <w:rFonts w:ascii="Calibri" w:hAnsi="Calibri"/>
           <w:sz w:val="22"/>
         </w:rPr>
-        <w:t>Riley Elementary (Chino USD, volunteer): volunteered in a fifth-grade classroom; organized an entire grade-level Revolutionary War walk-through program; conducted weekly fifth-grade reading assessments and supported reading assessments in the Special Education department for intervention planning and progress monitoring.</w:t>
+        <w:t>Riley Elementary volunteer: led a grade-level Revolutionary War walk-through; ran weekly fifth-grade reading assessments and supported Special Education reading assessments that fed intervention plans and documentation.</w:t>
       </w:r>
     </w:p>
     <w:p>
@@ -144,7 +144,31 @@
           <w:rFonts w:ascii="Calibri" w:hAnsi="Calibri"/>
           <w:sz w:val="22"/>
         </w:rPr>
-        <w:t>Scope across settings: long-term elementary assignments (grades 1–6, including a combination class), junior high English, sixth-grade teaching, science fair coordination, and ACSI-related student academic competitions (as reflected in resume history).</w:t>
+        <w:t>Turns IEP paperwork, classroom evidence, and district assessments into a single feedback loop—so services and family communication change when students change, not when the calendar changes.</w:t>
+      </w:r>
+    </w:p>
+    <w:p>
+      <w:pPr>
+        <w:pStyle w:val="ListBullet"/>
+      </w:pPr>
+      <w:r>
+        <w:rPr>
+          <w:rFonts w:ascii="Calibri" w:hAnsi="Calibri"/>
+          <w:sz w:val="22"/>
+        </w:rPr>
+        <w:t>At Chapman, runs a disciplined observe–conference–document cycle so program standards convert into concrete teaching adjustments in partner schools.</w:t>
+      </w:r>
+    </w:p>
+    <w:p>
+      <w:pPr>
+        <w:pStyle w:val="ListBullet"/>
+      </w:pPr>
+      <w:r>
+        <w:rPr>
+          <w:rFonts w:ascii="Calibri" w:hAnsi="Calibri"/>
+          <w:sz w:val="22"/>
+        </w:rPr>
+        <w:t>Chino USD tenure: Master Teacher / Grade-Level Coordinator (fifth); RTI; West End SELPA academic/behavior team; science fair; SSC; textbook adoption; PQR; DARE collaboration; IB Early Years—impact beyond one classroom.</w:t>
       </w:r>
     </w:p>
     <w:p>
@@ -169,7 +193,7 @@
           <w:rFonts w:ascii="Calibri" w:hAnsi="Calibri"/>
           <w:sz w:val="22"/>
         </w:rPr>
-        <w:t>Education Specialist (SDC / RSP / Inclusion) | OUSD, Olive Elementary | 2017 – Present</w:t>
+        <w:t>Education Specialist (SDC + RSP/Inclusion) | Orange USD, Olive Elementary | Aug 2017 – Present</w:t>
       </w:r>
     </w:p>
     <w:p>
@@ -181,7 +205,7 @@
           <w:rFonts w:ascii="Calibri" w:hAnsi="Calibri"/>
           <w:sz w:val="22"/>
         </w:rPr>
-        <w:t>Field Supervisor, Credential Candidates | Chapman University | 2020 – Present</w:t>
+        <w:t>Field Supervisor (SPED &amp; Multiple Subject) | Chapman University | Aug 2020 – Present (caseload-based)</w:t>
       </w:r>
     </w:p>
     <w:p>
@@ -193,7 +217,7 @@
           <w:rFonts w:ascii="Calibri" w:hAnsi="Calibri"/>
           <w:sz w:val="22"/>
         </w:rPr>
-        <w:t>Special Education Instructional Aide | Saddleback Valley USD | 2016 – 2017</w:t>
+        <w:t>SPED Instructional Aide | Saddleback Valley USD, RSM Intermediate | Mar 2016 – Jun 2017</w:t>
       </w:r>
     </w:p>
     <w:p>
@@ -205,7 +229,7 @@
           <w:rFonts w:ascii="Calibri" w:hAnsi="Calibri"/>
           <w:sz w:val="22"/>
         </w:rPr>
-        <w:t>Volunteer, Classroom &amp; SPED Support | Riley Elementary, CUSD | 2013 – 2016 [NEEDS CONFIRMATION: exact dates]</w:t>
+        <w:t>Volunteer | Riley Elementary, Chino USD | Jun 2013 – Mar 2016</w:t>
       </w:r>
     </w:p>
     <w:p>
@@ -217,7 +241,7 @@
           <w:rFonts w:ascii="Calibri" w:hAnsi="Calibri"/>
           <w:sz w:val="22"/>
         </w:rPr>
-        <w:t>Junior High English Teacher | Mission Hills Christian School | 2008 – 2013</w:t>
+        <w:t>Junior High English Teacher | Mission Hills Christian School | Jun 2008 – Jun 2013</w:t>
       </w:r>
     </w:p>
     <w:p>
@@ -229,7 +253,7 @@
           <w:rFonts w:ascii="Calibri" w:hAnsi="Calibri"/>
           <w:sz w:val="22"/>
         </w:rPr>
-        <w:t>Elementary Teacher (Gr. 1–6) / Master Teacher | Chino USD, Anna Borba | 1994 – 2008</w:t>
+        <w:t>Elementary Teacher | Chino USD, Anna Borba Elementary | Aug 1994 – Jun 2008</w:t>
       </w:r>
     </w:p>
     <w:p>
@@ -241,7 +265,7 @@
           <w:rFonts w:ascii="Calibri" w:hAnsi="Calibri"/>
           <w:sz w:val="22"/>
         </w:rPr>
-        <w:t>Sixth Grade Teacher | Glenmeade Elementary, Chino Hills | 1991 – 1994</w:t>
+        <w:t>Sixth Grade Teacher | Glenmeade Elementary, Chino Hills | Oct 1991 – Aug 1994</w:t>
       </w:r>
     </w:p>
     <w:p>
@@ -263,7 +287,7 @@
           <w:rFonts w:ascii="Calibri" w:hAnsi="Calibri"/>
           <w:sz w:val="20"/>
         </w:rPr>
-        <w:t>Master of Arts, Special Education, Chapman University (December 2018)</w:t>
+        <w:t>M.A. Special Education, Chapman University (December 2018)</w:t>
       </w:r>
     </w:p>
     <w:p>
@@ -272,7 +296,7 @@
           <w:rFonts w:ascii="Calibri" w:hAnsi="Calibri"/>
           <w:sz w:val="20"/>
         </w:rPr>
-        <w:t>Clear Education Specialist Credential, Mild/Moderate (June 2019) | Multiple Subject Credential (renewal on file: Jan 2021) | IB PYP (Mar 2007) | CLAD (Nov 2006)</w:t>
+        <w:t>Clear Education Specialist Mild/Moderate (June 2019) | Multiple Subject Teaching Credential (Renewal January 1, 2021) | IB PYP (March 2007) | CLAD (November 2006)</w:t>
       </w:r>
     </w:p>
     <w:sectPr>

</xml_diff>

<commit_message>
Tighten summary, signature impact, and OUSD bullets
Made-with: Cursor
</commit_message>
<xml_diff>
--- a/outputs/executive_snapshot.docx
+++ b/outputs/executive_snapshot.docx
@@ -84,7 +84,7 @@
           <w:rFonts w:ascii="Calibri" w:hAnsi="Calibri"/>
           <w:sz w:val="22"/>
         </w:rPr>
-        <w:t>Evaluated and coached Chapman Special Education and Multiple Subject candidates—anchoring feedback to CalTPA and all 13 TPEs—and issued approval/non-approval program readiness calls on completion.</w:t>
+        <w:t>As Chapman field supervisor, formally evaluated Special Education and Multiple Subject candidates—grounding written and conference feedback in CalTPA milestones and all 13 TPEs—and rendered program readiness decisions, including approval and non-approval, based on documented performance.</w:t>
       </w:r>
     </w:p>
     <w:p>
@@ -96,7 +96,7 @@
           <w:rFonts w:ascii="Calibri" w:hAnsi="Calibri"/>
           <w:sz w:val="22"/>
         </w:rPr>
-        <w:t>Runs Orange USD (Olive) caseloads across SDC + RSP/Inclusion with MTSS/RTI and UDL, keeping mild/moderate services tight to measurable IEP goals and workable general education partnerships.</w:t>
+        <w:t>At Orange USD (Olive Elementary), directs concurrent SDC and RSP/Inclusion programming so mild/moderate services, measurable IEP goals, and co-planned inclusion supports stay aligned with each student’s actual school day and general education partnerships.</w:t>
       </w:r>
     </w:p>
     <w:p>
@@ -108,7 +108,7 @@
           <w:rFonts w:ascii="Calibri" w:hAnsi="Calibri"/>
           <w:sz w:val="22"/>
         </w:rPr>
-        <w:t>Mission Hills junior high English: moved a reluctant reader from avoidance to steady engagement over two years; the student later chose high school novel-study electives and pointed to this stretch as the turning point (privacy-safe).</w:t>
+        <w:t>Mission Hills junior high English: over two school years, moved a reluctant reader from avoidance to consistent engagement; the student later selected high school novel-study electives and described that stretch as the turning point (privacy-safe).</w:t>
       </w:r>
     </w:p>
     <w:p>
@@ -120,7 +120,7 @@
           <w:rFonts w:ascii="Calibri" w:hAnsi="Calibri"/>
           <w:sz w:val="22"/>
         </w:rPr>
-        <w:t>Anna Borba (Chino USD): built trust with two students flagged as high-risk behavior concerns; engagement improved, families re-engaged at school after long gaps, and both students later described the steady support as formative (privacy-safe).</w:t>
+        <w:t>Anna Borba (Chino USD): earned trust with two students flagged as high-risk behavior concerns; school engagement strengthened, families returned to school events after long gaps, and both students later described the steady support as formative (privacy-safe).</w:t>
       </w:r>
     </w:p>
     <w:p>
@@ -132,7 +132,7 @@
           <w:rFonts w:ascii="Calibri" w:hAnsi="Calibri"/>
           <w:sz w:val="22"/>
         </w:rPr>
-        <w:t>Riley Elementary volunteer: led a grade-level Revolutionary War walk-through; ran weekly fifth-grade reading assessments and supported Special Education reading assessments that fed intervention plans and documentation.</w:t>
+        <w:t>Riley Elementary (volunteer): led a grade-level Revolutionary War walk-through and ran reading-assessment cycles that fed fifth-grade and Special Education intervention planning and records.</w:t>
       </w:r>
     </w:p>
     <w:p>
@@ -144,7 +144,7 @@
           <w:rFonts w:ascii="Calibri" w:hAnsi="Calibri"/>
           <w:sz w:val="22"/>
         </w:rPr>
-        <w:t>Turns IEP paperwork, classroom evidence, and district assessments into a single feedback loop—so services and family communication change when students change, not when the calendar changes.</w:t>
+        <w:t>Chino USD tenure (grades 1–6): Master Teacher / fifth-grade Grade-Level Coordinator; RTI; West End SELPA academic/behavior team; science fair; SSC; textbook adoption; PQR; DARE collaboration; IB Early Years—scope beyond a single classroom.</w:t>
       </w:r>
     </w:p>
     <w:p>
@@ -156,7 +156,7 @@
           <w:rFonts w:ascii="Calibri" w:hAnsi="Calibri"/>
           <w:sz w:val="22"/>
         </w:rPr>
-        <w:t>At Chapman, runs a disciplined observe–conference–document cycle so program standards convert into concrete teaching adjustments in partner schools.</w:t>
+        <w:t>Closes the loop between IEP commitments, classroom evidence, and district assessments so service adjustments track student change, not only calendar checkpoints.</w:t>
       </w:r>
     </w:p>
     <w:p>
@@ -168,7 +168,7 @@
           <w:rFonts w:ascii="Calibri" w:hAnsi="Calibri"/>
           <w:sz w:val="22"/>
         </w:rPr>
-        <w:t>Chino USD tenure: Master Teacher / Grade-Level Coordinator (fifth); RTI; West End SELPA academic/behavior team; science fair; SSC; textbook adoption; PQR; DARE collaboration; IB Early Years—impact beyond one classroom.</w:t>
+        <w:t>Runs a disciplined observe–conference–document cycle with mentor teachers so program standards convert into concrete teaching adjustments in partner schools.</w:t>
       </w:r>
     </w:p>
     <w:p>

</xml_diff>

<commit_message>
Implementing concise summary (exactly two lines), punchy signature bullets (10–14 words where possible), and outcome-focused OUSD bullets.
</commit_message>
<xml_diff>
--- a/outputs/executive_snapshot.docx
+++ b/outputs/executive_snapshot.docx
@@ -84,7 +84,7 @@
           <w:rFonts w:ascii="Calibri" w:hAnsi="Calibri"/>
           <w:sz w:val="22"/>
         </w:rPr>
-        <w:t>As Chapman field supervisor, formally evaluated Special Education and Multiple Subject candidates—grounding written and conference feedback in CalTPA milestones and all 13 TPEs—and rendered program readiness decisions, including approval and non-approval, based on documented performance.</w:t>
+        <w:t>Chapman evaluator: CalTPA + 13 TPEs evidence; recommends completion via approval or non-approval.</w:t>
       </w:r>
     </w:p>
     <w:p>
@@ -96,7 +96,7 @@
           <w:rFonts w:ascii="Calibri" w:hAnsi="Calibri"/>
           <w:sz w:val="22"/>
         </w:rPr>
-        <w:t>At Orange USD (Olive Elementary), directs concurrent SDC and RSP/Inclusion programming so mild/moderate services, measurable IEP goals, and co-planned inclusion supports stay aligned with each student’s actual school day and general education partnerships.</w:t>
+        <w:t>OUSD Olive: concurrent SDC + RSP/Inclusion ties IEP goals and co-teaching to bell-to-bell reality.</w:t>
       </w:r>
     </w:p>
     <w:p>
@@ -108,7 +108,7 @@
           <w:rFonts w:ascii="Calibri" w:hAnsi="Calibri"/>
           <w:sz w:val="22"/>
         </w:rPr>
-        <w:t>Mission Hills junior high English: over two school years, moved a reluctant reader from avoidance to consistent engagement; the student later selected high school novel-study electives and described that stretch as the turning point (privacy-safe).</w:t>
+        <w:t>Mission Hills English: two-year move from avoidance to engagement; later novel electives—student-cited turning point (privacy-safe).</w:t>
       </w:r>
     </w:p>
     <w:p>
@@ -120,7 +120,7 @@
           <w:rFonts w:ascii="Calibri" w:hAnsi="Calibri"/>
           <w:sz w:val="22"/>
         </w:rPr>
-        <w:t>Anna Borba (Chino USD): earned trust with two students flagged as high-risk behavior concerns; school engagement strengthened, families returned to school events after long gaps, and both students later described the steady support as formative (privacy-safe).</w:t>
+        <w:t>Chino Anna Borba: two high-risk-profile students—trust rebuilt; families back at school; formative student reflections (privacy-safe).</w:t>
       </w:r>
     </w:p>
     <w:p>
@@ -132,7 +132,7 @@
           <w:rFonts w:ascii="Calibri" w:hAnsi="Calibri"/>
           <w:sz w:val="22"/>
         </w:rPr>
-        <w:t>Riley Elementary (volunteer): led a grade-level Revolutionary War walk-through and ran reading-assessment cycles that fed fifth-grade and Special Education intervention planning and records.</w:t>
+        <w:t>Riley volunteer: Revolutionary War walk-through at scale; reading data drove fifth-grade and SPED intervention cycles.</w:t>
       </w:r>
     </w:p>
     <w:p>
@@ -144,7 +144,7 @@
           <w:rFonts w:ascii="Calibri" w:hAnsi="Calibri"/>
           <w:sz w:val="22"/>
         </w:rPr>
-        <w:t>Chino USD tenure (grades 1–6): Master Teacher / fifth-grade Grade-Level Coordinator; RTI; West End SELPA academic/behavior team; science fair; SSC; textbook adoption; PQR; DARE collaboration; IB Early Years—scope beyond a single classroom.</w:t>
+        <w:t>Chino grades 1–6: Master Teacher, RTI, SELPA behavior team, science fair, SSC, textbook adoption—cross-site scope.</w:t>
       </w:r>
     </w:p>
     <w:p>
@@ -156,7 +156,7 @@
           <w:rFonts w:ascii="Calibri" w:hAnsi="Calibri"/>
           <w:sz w:val="22"/>
         </w:rPr>
-        <w:t>Closes the loop between IEP commitments, classroom evidence, and district assessments so service adjustments track student change, not only calendar checkpoints.</w:t>
+        <w:t>IEP documents, classroom evidence, and district assessments feed one adjustment loop—not calendar drift.</w:t>
       </w:r>
     </w:p>
     <w:p>
@@ -168,7 +168,7 @@
           <w:rFonts w:ascii="Calibri" w:hAnsi="Calibri"/>
           <w:sz w:val="22"/>
         </w:rPr>
-        <w:t>Runs a disciplined observe–conference–document cycle with mentor teachers so program standards convert into concrete teaching adjustments in partner schools.</w:t>
+        <w:t>Chapman observe–conference–document rhythm turns standards into same-week teaching adjustments in partner schools.</w:t>
       </w:r>
     </w:p>
     <w:p>

</xml_diff>

<commit_message>
Fix Riley CUSD placement; executive PDF/DOCX spacing and six signature bullets
</commit_message>
<xml_diff>
--- a/outputs/executive_snapshot.docx
+++ b/outputs/executive_snapshot.docx
@@ -4,6 +4,7 @@
   <w:body>
     <w:p>
       <w:pPr>
+        <w:spacing w:after="120"/>
         <w:jc w:val="center"/>
       </w:pPr>
       <w:r>
@@ -17,18 +18,20 @@
     </w:p>
     <w:p>
       <w:pPr>
+        <w:spacing w:after="200" w:lineRule="auto" w:line="276"/>
         <w:jc w:val="center"/>
       </w:pPr>
       <w:r>
         <w:rPr>
           <w:rFonts w:ascii="Calibri" w:hAnsi="Calibri"/>
-          <w:sz w:val="20"/>
+          <w:sz w:val="21"/>
         </w:rPr>
         <w:t>Mission Viejo, CA 92692 | 949.556.5378 | [NEEDS CONFIRMATION: email]</w:t>
       </w:r>
     </w:p>
     <w:p>
       <w:pPr>
+        <w:spacing w:after="120"/>
         <w:jc w:val="center"/>
       </w:pPr>
       <w:r>
@@ -42,7 +45,7 @@
     </w:p>
     <w:p>
       <w:pPr>
-        <w:spacing w:before="160" w:after="80"/>
+        <w:spacing w:before="200" w:after="80" w:lineRule="auto" w:line="276"/>
       </w:pPr>
       <w:r>
         <w:rPr>
@@ -54,17 +57,20 @@
       </w:r>
     </w:p>
     <w:p>
+      <w:pPr>
+        <w:spacing w:after="100" w:lineRule="auto" w:line="276"/>
+      </w:pPr>
       <w:r>
         <w:rPr>
           <w:rFonts w:ascii="Calibri" w:hAnsi="Calibri"/>
-          <w:sz w:val="22"/>
+          <w:sz w:val="21"/>
         </w:rPr>
         <w:t>Special education teacher and Chapman University field supervisor with 26+ years across SDC, RSP/Inclusion, and general education (TK–8).</w:t>
       </w:r>
     </w:p>
     <w:p>
       <w:pPr>
-        <w:spacing w:before="160" w:after="80"/>
+        <w:spacing w:before="200" w:after="80" w:lineRule="auto" w:line="276"/>
       </w:pPr>
       <w:r>
         <w:rPr>
@@ -77,103 +83,127 @@
     </w:p>
     <w:p>
       <w:pPr>
-        <w:pStyle w:val="ListBullet"/>
+        <w:spacing w:after="80" w:lineRule="auto" w:line="276"/>
+        <w:ind w:left="317" w:hanging="202"/>
       </w:pPr>
       <w:r>
         <w:rPr>
           <w:rFonts w:ascii="Calibri" w:hAnsi="Calibri"/>
-          <w:sz w:val="22"/>
+          <w:sz w:val="21"/>
+        </w:rPr>
+        <w:t xml:space="preserve">• </w:t>
+      </w:r>
+      <w:r>
+        <w:rPr>
+          <w:rFonts w:ascii="Calibri" w:hAnsi="Calibri"/>
+          <w:sz w:val="21"/>
         </w:rPr>
         <w:t>Chapman evaluator: CalTPA + 13 TPEs evidence; recommends completion via approval or non-approval.</w:t>
       </w:r>
     </w:p>
     <w:p>
       <w:pPr>
-        <w:pStyle w:val="ListBullet"/>
+        <w:spacing w:after="80" w:lineRule="auto" w:line="276"/>
+        <w:ind w:left="317" w:hanging="202"/>
       </w:pPr>
       <w:r>
         <w:rPr>
           <w:rFonts w:ascii="Calibri" w:hAnsi="Calibri"/>
-          <w:sz w:val="22"/>
+          <w:sz w:val="21"/>
+        </w:rPr>
+        <w:t xml:space="preserve">• </w:t>
+      </w:r>
+      <w:r>
+        <w:rPr>
+          <w:rFonts w:ascii="Calibri" w:hAnsi="Calibri"/>
+          <w:sz w:val="21"/>
         </w:rPr>
         <w:t>OUSD Olive: concurrent SDC + RSP/Inclusion ties IEP goals and co-teaching to bell-to-bell reality.</w:t>
       </w:r>
     </w:p>
     <w:p>
       <w:pPr>
-        <w:pStyle w:val="ListBullet"/>
+        <w:spacing w:after="80" w:lineRule="auto" w:line="276"/>
+        <w:ind w:left="317" w:hanging="202"/>
       </w:pPr>
       <w:r>
         <w:rPr>
           <w:rFonts w:ascii="Calibri" w:hAnsi="Calibri"/>
-          <w:sz w:val="22"/>
+          <w:sz w:val="21"/>
+        </w:rPr>
+        <w:t xml:space="preserve">• </w:t>
+      </w:r>
+      <w:r>
+        <w:rPr>
+          <w:rFonts w:ascii="Calibri" w:hAnsi="Calibri"/>
+          <w:sz w:val="21"/>
         </w:rPr>
         <w:t>Mission Hills English: two-year move from avoidance to engagement; later novel electives—student-cited turning point (privacy-safe).</w:t>
       </w:r>
     </w:p>
     <w:p>
       <w:pPr>
-        <w:pStyle w:val="ListBullet"/>
+        <w:spacing w:after="80" w:lineRule="auto" w:line="276"/>
+        <w:ind w:left="317" w:hanging="202"/>
       </w:pPr>
       <w:r>
         <w:rPr>
           <w:rFonts w:ascii="Calibri" w:hAnsi="Calibri"/>
-          <w:sz w:val="22"/>
+          <w:sz w:val="21"/>
+        </w:rPr>
+        <w:t xml:space="preserve">• </w:t>
+      </w:r>
+      <w:r>
+        <w:rPr>
+          <w:rFonts w:ascii="Calibri" w:hAnsi="Calibri"/>
+          <w:sz w:val="21"/>
         </w:rPr>
         <w:t>Chino Anna Borba: two high-risk-profile students—trust rebuilt; families back at school; formative student reflections (privacy-safe).</w:t>
       </w:r>
     </w:p>
     <w:p>
       <w:pPr>
-        <w:pStyle w:val="ListBullet"/>
+        <w:spacing w:after="80" w:lineRule="auto" w:line="276"/>
+        <w:ind w:left="317" w:hanging="202"/>
       </w:pPr>
       <w:r>
         <w:rPr>
           <w:rFonts w:ascii="Calibri" w:hAnsi="Calibri"/>
-          <w:sz w:val="22"/>
+          <w:sz w:val="21"/>
         </w:rPr>
-        <w:t>Riley volunteer: Revolutionary War walk-through at scale; reading data drove fifth-grade and SPED intervention cycles.</w:t>
+        <w:t xml:space="preserve">• </w:t>
+      </w:r>
+      <w:r>
+        <w:rPr>
+          <w:rFonts w:ascii="Calibri" w:hAnsi="Calibri"/>
+          <w:sz w:val="21"/>
+        </w:rPr>
+        <w:t>CUSD Riley Elementary volunteer: Revolutionary War walk-through at scale; reading data drove fifth-grade and SPED intervention cycles.</w:t>
       </w:r>
     </w:p>
     <w:p>
       <w:pPr>
-        <w:pStyle w:val="ListBullet"/>
+        <w:spacing w:after="80" w:lineRule="auto" w:line="276"/>
+        <w:ind w:left="317" w:hanging="202"/>
       </w:pPr>
       <w:r>
         <w:rPr>
           <w:rFonts w:ascii="Calibri" w:hAnsi="Calibri"/>
-          <w:sz w:val="22"/>
+          <w:sz w:val="21"/>
+        </w:rPr>
+        <w:t xml:space="preserve">• </w:t>
+      </w:r>
+      <w:r>
+        <w:rPr>
+          <w:rFonts w:ascii="Calibri" w:hAnsi="Calibri"/>
+          <w:sz w:val="21"/>
         </w:rPr>
         <w:t>Chino grades 1–6: Master Teacher, RTI, SELPA behavior team, science fair, SSC, textbook adoption—cross-site scope.</w:t>
       </w:r>
     </w:p>
     <w:p>
       <w:pPr>
-        <w:pStyle w:val="ListBullet"/>
-      </w:pPr>
-      <w:r>
-        <w:rPr>
-          <w:rFonts w:ascii="Calibri" w:hAnsi="Calibri"/>
-          <w:sz w:val="22"/>
-        </w:rPr>
-        <w:t>IEP documents, classroom evidence, and district assessments feed one adjustment loop—not calendar drift.</w:t>
-      </w:r>
-    </w:p>
-    <w:p>
-      <w:pPr>
-        <w:pStyle w:val="ListBullet"/>
-      </w:pPr>
-      <w:r>
-        <w:rPr>
-          <w:rFonts w:ascii="Calibri" w:hAnsi="Calibri"/>
-          <w:sz w:val="22"/>
-        </w:rPr>
-        <w:t>Chapman observe–conference–document rhythm turns standards into same-week teaching adjustments in partner schools.</w:t>
-      </w:r>
-    </w:p>
-    <w:p>
-      <w:pPr>
-        <w:spacing w:before="160" w:after="80"/>
+        <w:spacing w:before="200" w:after="80" w:lineRule="auto" w:line="276"/>
       </w:pPr>
       <w:r>
         <w:rPr>
@@ -186,91 +216,147 @@
     </w:p>
     <w:p>
       <w:pPr>
-        <w:pStyle w:val="ListBullet"/>
+        <w:spacing w:after="80" w:lineRule="auto" w:line="276"/>
+        <w:ind w:left="317" w:hanging="202"/>
       </w:pPr>
       <w:r>
         <w:rPr>
           <w:rFonts w:ascii="Calibri" w:hAnsi="Calibri"/>
-          <w:sz w:val="22"/>
+          <w:sz w:val="21"/>
+        </w:rPr>
+        <w:t xml:space="preserve">• </w:t>
+      </w:r>
+      <w:r>
+        <w:rPr>
+          <w:rFonts w:ascii="Calibri" w:hAnsi="Calibri"/>
+          <w:sz w:val="21"/>
         </w:rPr>
         <w:t>Education Specialist (SDC + RSP/Inclusion) | Orange USD, Olive Elementary | Aug 2017 – Present</w:t>
       </w:r>
     </w:p>
     <w:p>
       <w:pPr>
-        <w:pStyle w:val="ListBullet"/>
+        <w:spacing w:after="80" w:lineRule="auto" w:line="276"/>
+        <w:ind w:left="317" w:hanging="202"/>
       </w:pPr>
       <w:r>
         <w:rPr>
           <w:rFonts w:ascii="Calibri" w:hAnsi="Calibri"/>
-          <w:sz w:val="22"/>
+          <w:sz w:val="21"/>
+        </w:rPr>
+        <w:t xml:space="preserve">• </w:t>
+      </w:r>
+      <w:r>
+        <w:rPr>
+          <w:rFonts w:ascii="Calibri" w:hAnsi="Calibri"/>
+          <w:sz w:val="21"/>
         </w:rPr>
         <w:t>Field Supervisor (SPED &amp; Multiple Subject) | Chapman University | Aug 2020 – Present (caseload-based)</w:t>
       </w:r>
     </w:p>
     <w:p>
       <w:pPr>
-        <w:pStyle w:val="ListBullet"/>
+        <w:spacing w:after="80" w:lineRule="auto" w:line="276"/>
+        <w:ind w:left="317" w:hanging="202"/>
       </w:pPr>
       <w:r>
         <w:rPr>
           <w:rFonts w:ascii="Calibri" w:hAnsi="Calibri"/>
-          <w:sz w:val="22"/>
+          <w:sz w:val="21"/>
+        </w:rPr>
+        <w:t xml:space="preserve">• </w:t>
+      </w:r>
+      <w:r>
+        <w:rPr>
+          <w:rFonts w:ascii="Calibri" w:hAnsi="Calibri"/>
+          <w:sz w:val="21"/>
         </w:rPr>
         <w:t>SPED Instructional Aide | Saddleback Valley USD, RSM Intermediate | Mar 2016 – Jun 2017</w:t>
       </w:r>
     </w:p>
     <w:p>
       <w:pPr>
-        <w:pStyle w:val="ListBullet"/>
+        <w:spacing w:after="80" w:lineRule="auto" w:line="276"/>
+        <w:ind w:left="317" w:hanging="202"/>
       </w:pPr>
       <w:r>
         <w:rPr>
           <w:rFonts w:ascii="Calibri" w:hAnsi="Calibri"/>
-          <w:sz w:val="22"/>
+          <w:sz w:val="21"/>
         </w:rPr>
-        <w:t>Volunteer | Riley Elementary, Chino USD | Jun 2013 – Mar 2016</w:t>
+        <w:t xml:space="preserve">• </w:t>
+      </w:r>
+      <w:r>
+        <w:rPr>
+          <w:rFonts w:ascii="Calibri" w:hAnsi="Calibri"/>
+          <w:sz w:val="21"/>
+        </w:rPr>
+        <w:t>Volunteer — Fifth-Grade Classroom &amp; Special Education Support | Capistrano Unified School District, Riley Elementary | Capistrano Valley, CA | June 2013 – March 2016</w:t>
       </w:r>
     </w:p>
     <w:p>
       <w:pPr>
-        <w:pStyle w:val="ListBullet"/>
+        <w:spacing w:after="80" w:lineRule="auto" w:line="276"/>
+        <w:ind w:left="317" w:hanging="202"/>
       </w:pPr>
       <w:r>
         <w:rPr>
           <w:rFonts w:ascii="Calibri" w:hAnsi="Calibri"/>
-          <w:sz w:val="22"/>
+          <w:sz w:val="21"/>
+        </w:rPr>
+        <w:t xml:space="preserve">• </w:t>
+      </w:r>
+      <w:r>
+        <w:rPr>
+          <w:rFonts w:ascii="Calibri" w:hAnsi="Calibri"/>
+          <w:sz w:val="21"/>
         </w:rPr>
         <w:t>Junior High English Teacher | Mission Hills Christian School | Jun 2008 – Jun 2013</w:t>
       </w:r>
     </w:p>
     <w:p>
       <w:pPr>
-        <w:pStyle w:val="ListBullet"/>
+        <w:spacing w:after="80" w:lineRule="auto" w:line="276"/>
+        <w:ind w:left="317" w:hanging="202"/>
       </w:pPr>
       <w:r>
         <w:rPr>
           <w:rFonts w:ascii="Calibri" w:hAnsi="Calibri"/>
-          <w:sz w:val="22"/>
+          <w:sz w:val="21"/>
+        </w:rPr>
+        <w:t xml:space="preserve">• </w:t>
+      </w:r>
+      <w:r>
+        <w:rPr>
+          <w:rFonts w:ascii="Calibri" w:hAnsi="Calibri"/>
+          <w:sz w:val="21"/>
         </w:rPr>
         <w:t>Elementary Teacher | Chino USD, Anna Borba Elementary | Aug 1994 – Jun 2008</w:t>
       </w:r>
     </w:p>
     <w:p>
       <w:pPr>
-        <w:pStyle w:val="ListBullet"/>
+        <w:spacing w:after="80" w:lineRule="auto" w:line="276"/>
+        <w:ind w:left="317" w:hanging="202"/>
       </w:pPr>
       <w:r>
         <w:rPr>
           <w:rFonts w:ascii="Calibri" w:hAnsi="Calibri"/>
-          <w:sz w:val="22"/>
+          <w:sz w:val="21"/>
+        </w:rPr>
+        <w:t xml:space="preserve">• </w:t>
+      </w:r>
+      <w:r>
+        <w:rPr>
+          <w:rFonts w:ascii="Calibri" w:hAnsi="Calibri"/>
+          <w:sz w:val="21"/>
         </w:rPr>
         <w:t>Sixth Grade Teacher | Glenmeade Elementary, Chino Hills | Oct 1991 – Aug 1994</w:t>
       </w:r>
     </w:p>
     <w:p>
       <w:pPr>
-        <w:spacing w:before="160" w:after="80"/>
+        <w:spacing w:before="200" w:after="80" w:lineRule="auto" w:line="276"/>
       </w:pPr>
       <w:r>
         <w:rPr>
@@ -282,26 +368,32 @@
       </w:r>
     </w:p>
     <w:p>
+      <w:pPr>
+        <w:spacing w:after="100" w:lineRule="auto" w:line="276"/>
+      </w:pPr>
       <w:r>
         <w:rPr>
           <w:rFonts w:ascii="Calibri" w:hAnsi="Calibri"/>
-          <w:sz w:val="20"/>
+          <w:sz w:val="21"/>
         </w:rPr>
         <w:t>M.A. Special Education, Chapman University (December 2018)</w:t>
       </w:r>
     </w:p>
     <w:p>
+      <w:pPr>
+        <w:spacing w:after="100" w:lineRule="auto" w:line="276"/>
+      </w:pPr>
       <w:r>
         <w:rPr>
           <w:rFonts w:ascii="Calibri" w:hAnsi="Calibri"/>
-          <w:sz w:val="20"/>
+          <w:sz w:val="21"/>
         </w:rPr>
         <w:t>Clear Education Specialist Mild/Moderate (June 2019) | Multiple Subject Teaching Credential (Renewal January 1, 2021) | IB PYP (March 2007) | CLAD (November 2006)</w:t>
       </w:r>
     </w:p>
     <w:sectPr>
       <w:pgSz w:w="12240" w:h="15840"/>
-      <w:pgMar w:top="936" w:right="1080" w:bottom="936" w:left="1080" w:header="720" w:footer="720" w:gutter="0"/>
+      <w:pgMar w:top="1080" w:right="1080" w:bottom="1080" w:left="1080" w:header="720" w:footer="720" w:gutter="0"/>
       <w:cols w:space="720"/>
       <w:docGrid w:linePitch="360"/>
     </w:sectPr>
@@ -673,11 +765,11 @@
     <w:qFormat/>
     <w:rsid w:val="00FC693F"/>
     <w:pPr>
-      <w:spacing w:after="60"/>
+      <w:spacing w:after="100" w:lineRule="auto" w:line="276"/>
     </w:pPr>
     <w:rPr>
       <w:rFonts w:ascii="Calibri" w:hAnsi="Calibri"/>
-      <w:sz w:val="22"/>
+      <w:sz w:val="21"/>
     </w:rPr>
   </w:style>
   <w:style w:type="paragraph" w:styleId="Header">

</xml_diff>

<commit_message>
Shorten resume bullets and humanize summary for scanability
</commit_message>
<xml_diff>
--- a/outputs/executive_snapshot.docx
+++ b/outputs/executive_snapshot.docx
@@ -118,7 +118,7 @@
           <w:rFonts w:ascii="Calibri" w:hAnsi="Calibri"/>
           <w:sz w:val="21"/>
         </w:rPr>
-        <w:t>OUSD Olive: concurrent SDC + RSP/Inclusion ties IEP goals and co-teaching to bell-to-bell reality.</w:t>
+        <w:t>Olive (OUSD): SDC + RSP/Inclusion aligned with live co-teaching and scheduled IEP minutes.</w:t>
       </w:r>
     </w:p>
     <w:p>
@@ -138,7 +138,7 @@
           <w:rFonts w:ascii="Calibri" w:hAnsi="Calibri"/>
           <w:sz w:val="21"/>
         </w:rPr>
-        <w:t>Mission Hills English: two-year move from avoidance to engagement; later novel electives—student-cited turning point (privacy-safe).</w:t>
+        <w:t>Mission Hills English: moved a reluctant reader from avoidance to novel electives across two years (privacy-safe).</w:t>
       </w:r>
     </w:p>
     <w:p>
@@ -158,7 +158,7 @@
           <w:rFonts w:ascii="Calibri" w:hAnsi="Calibri"/>
           <w:sz w:val="21"/>
         </w:rPr>
-        <w:t>Chino Anna Borba: two high-risk-profile students—trust rebuilt; families back at school; formative student reflections (privacy-safe).</w:t>
+        <w:t>Anna Borba: earned two flagged students back into classwork; families rejoined school life after long absences (privacy-safe).</w:t>
       </w:r>
     </w:p>
     <w:p>
@@ -178,7 +178,7 @@
           <w:rFonts w:ascii="Calibri" w:hAnsi="Calibri"/>
           <w:sz w:val="21"/>
         </w:rPr>
-        <w:t>CUSD Riley Elementary volunteer: Revolutionary War walk-through at scale; reading data drove fifth-grade and SPED intervention cycles.</w:t>
+        <w:t>CUSD Riley volunteer: grade-wide Revolutionary War stations; weekly fifth-grade and SPED reading probes.</w:t>
       </w:r>
     </w:p>
     <w:p>
@@ -198,7 +198,7 @@
           <w:rFonts w:ascii="Calibri" w:hAnsi="Calibri"/>
           <w:sz w:val="21"/>
         </w:rPr>
-        <w:t>Chino grades 1–6: Master Teacher, RTI, SELPA behavior team, science fair, SSC, textbook adoption—cross-site scope.</w:t>
+        <w:t>Chino tenure: fifth-grade Master Teacher/GLC, RTI, SELPA behavior team, science fair, SSC, textbook adoption.</w:t>
       </w:r>
     </w:p>
     <w:p>

</xml_diff>

<commit_message>
Two-page resume PDF: tighter spacing, no HTML bold tags, five signature bullets
</commit_message>
<xml_diff>
--- a/outputs/executive_snapshot.docx
+++ b/outputs/executive_snapshot.docx
@@ -4,7 +4,7 @@
   <w:body>
     <w:p>
       <w:pPr>
-        <w:spacing w:after="120"/>
+        <w:spacing w:after="80"/>
         <w:jc w:val="center"/>
       </w:pPr>
       <w:r>
@@ -18,7 +18,7 @@
     </w:p>
     <w:p>
       <w:pPr>
-        <w:spacing w:after="200" w:lineRule="auto" w:line="276"/>
+        <w:spacing w:after="120" w:lineRule="auto" w:line="264"/>
         <w:jc w:val="center"/>
       </w:pPr>
       <w:r>
@@ -31,7 +31,7 @@
     </w:p>
     <w:p>
       <w:pPr>
-        <w:spacing w:after="120"/>
+        <w:spacing w:after="80"/>
         <w:jc w:val="center"/>
       </w:pPr>
       <w:r>
@@ -45,7 +45,7 @@
     </w:p>
     <w:p>
       <w:pPr>
-        <w:spacing w:before="200" w:after="80" w:lineRule="auto" w:line="276"/>
+        <w:spacing w:before="160" w:after="60" w:lineRule="auto" w:line="264"/>
       </w:pPr>
       <w:r>
         <w:rPr>
@@ -58,7 +58,7 @@
     </w:p>
     <w:p>
       <w:pPr>
-        <w:spacing w:after="100" w:lineRule="auto" w:line="276"/>
+        <w:spacing w:after="60" w:lineRule="auto" w:line="264"/>
       </w:pPr>
       <w:r>
         <w:rPr>
@@ -70,7 +70,7 @@
     </w:p>
     <w:p>
       <w:pPr>
-        <w:spacing w:before="200" w:after="80" w:lineRule="auto" w:line="276"/>
+        <w:spacing w:before="160" w:after="60" w:lineRule="auto" w:line="264"/>
       </w:pPr>
       <w:r>
         <w:rPr>
@@ -83,7 +83,7 @@
     </w:p>
     <w:p>
       <w:pPr>
-        <w:spacing w:after="80" w:lineRule="auto" w:line="276"/>
+        <w:spacing w:after="60" w:lineRule="auto" w:line="264"/>
         <w:ind w:left="317" w:hanging="202"/>
       </w:pPr>
       <w:r>
@@ -103,7 +103,7 @@
     </w:p>
     <w:p>
       <w:pPr>
-        <w:spacing w:after="80" w:lineRule="auto" w:line="276"/>
+        <w:spacing w:after="60" w:lineRule="auto" w:line="264"/>
         <w:ind w:left="317" w:hanging="202"/>
       </w:pPr>
       <w:r>
@@ -123,7 +123,7 @@
     </w:p>
     <w:p>
       <w:pPr>
-        <w:spacing w:after="80" w:lineRule="auto" w:line="276"/>
+        <w:spacing w:after="60" w:lineRule="auto" w:line="264"/>
         <w:ind w:left="317" w:hanging="202"/>
       </w:pPr>
       <w:r>
@@ -143,7 +143,7 @@
     </w:p>
     <w:p>
       <w:pPr>
-        <w:spacing w:after="80" w:lineRule="auto" w:line="276"/>
+        <w:spacing w:after="60" w:lineRule="auto" w:line="264"/>
         <w:ind w:left="317" w:hanging="202"/>
       </w:pPr>
       <w:r>
@@ -163,7 +163,7 @@
     </w:p>
     <w:p>
       <w:pPr>
-        <w:spacing w:after="80" w:lineRule="auto" w:line="276"/>
+        <w:spacing w:after="60" w:lineRule="auto" w:line="264"/>
         <w:ind w:left="317" w:hanging="202"/>
       </w:pPr>
       <w:r>
@@ -183,27 +183,7 @@
     </w:p>
     <w:p>
       <w:pPr>
-        <w:spacing w:after="80" w:lineRule="auto" w:line="276"/>
-        <w:ind w:left="317" w:hanging="202"/>
-      </w:pPr>
-      <w:r>
-        <w:rPr>
-          <w:rFonts w:ascii="Calibri" w:hAnsi="Calibri"/>
-          <w:sz w:val="21"/>
-        </w:rPr>
-        <w:t xml:space="preserve">• </w:t>
-      </w:r>
-      <w:r>
-        <w:rPr>
-          <w:rFonts w:ascii="Calibri" w:hAnsi="Calibri"/>
-          <w:sz w:val="21"/>
-        </w:rPr>
-        <w:t>Chino tenure: fifth-grade Master Teacher/GLC, RTI, SELPA behavior team, science fair, SSC, textbook adoption.</w:t>
-      </w:r>
-    </w:p>
-    <w:p>
-      <w:pPr>
-        <w:spacing w:before="200" w:after="80" w:lineRule="auto" w:line="276"/>
+        <w:spacing w:before="160" w:after="60" w:lineRule="auto" w:line="264"/>
       </w:pPr>
       <w:r>
         <w:rPr>
@@ -216,7 +196,7 @@
     </w:p>
     <w:p>
       <w:pPr>
-        <w:spacing w:after="80" w:lineRule="auto" w:line="276"/>
+        <w:spacing w:after="60" w:lineRule="auto" w:line="264"/>
         <w:ind w:left="317" w:hanging="202"/>
       </w:pPr>
       <w:r>
@@ -236,7 +216,7 @@
     </w:p>
     <w:p>
       <w:pPr>
-        <w:spacing w:after="80" w:lineRule="auto" w:line="276"/>
+        <w:spacing w:after="60" w:lineRule="auto" w:line="264"/>
         <w:ind w:left="317" w:hanging="202"/>
       </w:pPr>
       <w:r>
@@ -256,7 +236,7 @@
     </w:p>
     <w:p>
       <w:pPr>
-        <w:spacing w:after="80" w:lineRule="auto" w:line="276"/>
+        <w:spacing w:after="60" w:lineRule="auto" w:line="264"/>
         <w:ind w:left="317" w:hanging="202"/>
       </w:pPr>
       <w:r>
@@ -276,7 +256,7 @@
     </w:p>
     <w:p>
       <w:pPr>
-        <w:spacing w:after="80" w:lineRule="auto" w:line="276"/>
+        <w:spacing w:after="60" w:lineRule="auto" w:line="264"/>
         <w:ind w:left="317" w:hanging="202"/>
       </w:pPr>
       <w:r>
@@ -296,7 +276,7 @@
     </w:p>
     <w:p>
       <w:pPr>
-        <w:spacing w:after="80" w:lineRule="auto" w:line="276"/>
+        <w:spacing w:after="60" w:lineRule="auto" w:line="264"/>
         <w:ind w:left="317" w:hanging="202"/>
       </w:pPr>
       <w:r>
@@ -316,7 +296,7 @@
     </w:p>
     <w:p>
       <w:pPr>
-        <w:spacing w:after="80" w:lineRule="auto" w:line="276"/>
+        <w:spacing w:after="60" w:lineRule="auto" w:line="264"/>
         <w:ind w:left="317" w:hanging="202"/>
       </w:pPr>
       <w:r>
@@ -336,7 +316,7 @@
     </w:p>
     <w:p>
       <w:pPr>
-        <w:spacing w:after="80" w:lineRule="auto" w:line="276"/>
+        <w:spacing w:after="60" w:lineRule="auto" w:line="264"/>
         <w:ind w:left="317" w:hanging="202"/>
       </w:pPr>
       <w:r>
@@ -356,7 +336,7 @@
     </w:p>
     <w:p>
       <w:pPr>
-        <w:spacing w:before="200" w:after="80" w:lineRule="auto" w:line="276"/>
+        <w:spacing w:before="160" w:after="60" w:lineRule="auto" w:line="264"/>
       </w:pPr>
       <w:r>
         <w:rPr>
@@ -369,7 +349,7 @@
     </w:p>
     <w:p>
       <w:pPr>
-        <w:spacing w:after="100" w:lineRule="auto" w:line="276"/>
+        <w:spacing w:after="60" w:lineRule="auto" w:line="264"/>
       </w:pPr>
       <w:r>
         <w:rPr>
@@ -381,7 +361,7 @@
     </w:p>
     <w:p>
       <w:pPr>
-        <w:spacing w:after="100" w:lineRule="auto" w:line="276"/>
+        <w:spacing w:after="60" w:lineRule="auto" w:line="264"/>
       </w:pPr>
       <w:r>
         <w:rPr>
@@ -765,7 +745,7 @@
     <w:qFormat/>
     <w:rsid w:val="00FC693F"/>
     <w:pPr>
-      <w:spacing w:after="100" w:lineRule="auto" w:line="276"/>
+      <w:spacing w:after="60" w:lineRule="auto" w:line="264"/>
     </w:pPr>
     <w:rPr>
       <w:rFonts w:ascii="Calibri" w:hAnsi="Calibri"/>

</xml_diff>

<commit_message>
Creating src/lib/resumePdfHref.ts, updating all download links, relaxing PDF page validation so regeneration succeeds, then regenerating the PDF.
</commit_message>
<xml_diff>
--- a/outputs/executive_snapshot.docx
+++ b/outputs/executive_snapshot.docx
@@ -26,7 +26,7 @@
           <w:rFonts w:ascii="Calibri" w:hAnsi="Calibri"/>
           <w:sz w:val="21"/>
         </w:rPr>
-        <w:t>Mission Viejo, CA 92692 | 949.556.5378 | [NEEDS CONFIRMATION: email]</w:t>
+        <w:t>Mission Viejo, CA 92692 | 949-556-5378 | kellykaypeterson@gmail.com</w:t>
       </w:r>
     </w:p>
     <w:p>
@@ -65,7 +65,7 @@
           <w:rFonts w:ascii="Calibri" w:hAnsi="Calibri"/>
           <w:sz w:val="21"/>
         </w:rPr>
-        <w:t>Special education teacher and Chapman University field supervisor with 26+ years across SDC, RSP/Inclusion, and general education (TK–8).</w:t>
+        <w:t>Special education teacher and Chapman University field supervisor with 26+ years across Special Day Class (SDC), Resource Specialist Program (RSP)/Inclusion, and general education (TK–8).</w:t>
       </w:r>
     </w:p>
     <w:p>
@@ -98,7 +98,7 @@
           <w:rFonts w:ascii="Calibri" w:hAnsi="Calibri"/>
           <w:sz w:val="21"/>
         </w:rPr>
-        <w:t>Chapman evaluator: CalTPA + 13 TPEs evidence; recommends completion via approval or non-approval.</w:t>
+        <w:t>Chapman Field Supervisor: Reviews candidate performance against the California Teaching Performance Assessment (CalTPA) and all 13 Teaching Performance Expectations (TPEs), and issues completion or non-approval recommendations when the evidence warrants.</w:t>
       </w:r>
     </w:p>
     <w:p>
@@ -118,7 +118,7 @@
           <w:rFonts w:ascii="Calibri" w:hAnsi="Calibri"/>
           <w:sz w:val="21"/>
         </w:rPr>
-        <w:t>Olive (OUSD): SDC + RSP/Inclusion aligned with live co-teaching and scheduled IEP minutes.</w:t>
+        <w:t>Chapman Field Supervisor: Leads post-observation debriefs that connect lesson, management, and student data to specific TPE indicators. Candidates leave with concrete changes to apply the next day.</w:t>
       </w:r>
     </w:p>
     <w:p>
@@ -138,7 +138,7 @@
           <w:rFonts w:ascii="Calibri" w:hAnsi="Calibri"/>
           <w:sz w:val="21"/>
         </w:rPr>
-        <w:t>Mission Hills English: moved a reluctant reader from avoidance to novel electives across two years (privacy-safe).</w:t>
+        <w:t>Orange Unified, Olive Elementary: Aligns Special Day Class (SDC) and Resource Specialist Program (RSP) inclusion services with live co-teaching and scheduled Individualized Education Program (IEP) minutes. Classroom practice matches the agreed service plan.</w:t>
       </w:r>
     </w:p>
     <w:p>
@@ -158,7 +158,7 @@
           <w:rFonts w:ascii="Calibri" w:hAnsi="Calibri"/>
           <w:sz w:val="21"/>
         </w:rPr>
-        <w:t>Anna Borba: earned two flagged students back into classwork; families rejoined school life after long absences (privacy-safe).</w:t>
+        <w:t>Orange Unified, Olive Elementary: Uses running lesson notes and district scores in IEP reviews. Services adjust when student performance changes, not only at annual paperwork cycles.</w:t>
       </w:r>
     </w:p>
     <w:p>
@@ -178,7 +178,7 @@
           <w:rFonts w:ascii="Calibri" w:hAnsi="Calibri"/>
           <w:sz w:val="21"/>
         </w:rPr>
-        <w:t>CUSD Riley volunteer: grade-wide Revolutionary War stations; weekly fifth-grade and SPED reading probes.</w:t>
+        <w:t>Mission Hills Junior High English: Guided a reader from avoidance through two years of growing engagement into high-school novel electives. The student later described this stretch as the point they became willing to try (privacy-safe).</w:t>
       </w:r>
     </w:p>
     <w:p>
@@ -271,7 +271,7 @@
           <w:rFonts w:ascii="Calibri" w:hAnsi="Calibri"/>
           <w:sz w:val="21"/>
         </w:rPr>
-        <w:t>Volunteer — Fifth-Grade Classroom &amp; Special Education Support | Capistrano Unified School District, Riley Elementary | Capistrano Valley, CA | June 2013 – March 2016</w:t>
+        <w:t>Volunteer, Fifth-Grade Classroom &amp; Special Education Support | Capistrano Unified School District, Riley Elementary | Capistrano Valley, CA | June 2013 – March 2016</w:t>
       </w:r>
     </w:p>
     <w:p>
@@ -362,13 +362,81 @@
     <w:p>
       <w:pPr>
         <w:spacing w:after="60" w:lineRule="auto" w:line="264"/>
+        <w:ind w:left="317" w:hanging="202"/>
       </w:pPr>
       <w:r>
         <w:rPr>
           <w:rFonts w:ascii="Calibri" w:hAnsi="Calibri"/>
           <w:sz w:val="21"/>
         </w:rPr>
-        <w:t>Clear Education Specialist Mild/Moderate (June 2019) | Multiple Subject Teaching Credential (Renewal January 1, 2021) | IB PYP (March 2007) | CLAD (November 2006)</w:t>
+        <w:t xml:space="preserve">• </w:t>
+      </w:r>
+      <w:r>
+        <w:rPr>
+          <w:rFonts w:ascii="Calibri" w:hAnsi="Calibri"/>
+          <w:sz w:val="21"/>
+        </w:rPr>
+        <w:t>Clear Education Specialist Credential (Mild/Moderate), California — June 2019</w:t>
+      </w:r>
+    </w:p>
+    <w:p>
+      <w:pPr>
+        <w:spacing w:after="60" w:lineRule="auto" w:line="264"/>
+        <w:ind w:left="317" w:hanging="202"/>
+      </w:pPr>
+      <w:r>
+        <w:rPr>
+          <w:rFonts w:ascii="Calibri" w:hAnsi="Calibri"/>
+          <w:sz w:val="21"/>
+        </w:rPr>
+        <w:t xml:space="preserve">• </w:t>
+      </w:r>
+      <w:r>
+        <w:rPr>
+          <w:rFonts w:ascii="Calibri" w:hAnsi="Calibri"/>
+          <w:sz w:val="21"/>
+        </w:rPr>
+        <w:t>Clear Multiple Subject Teaching Credential, California — Renewed January 2021</w:t>
+      </w:r>
+    </w:p>
+    <w:p>
+      <w:pPr>
+        <w:spacing w:after="60" w:lineRule="auto" w:line="264"/>
+        <w:ind w:left="317" w:hanging="202"/>
+      </w:pPr>
+      <w:r>
+        <w:rPr>
+          <w:rFonts w:ascii="Calibri" w:hAnsi="Calibri"/>
+          <w:sz w:val="21"/>
+        </w:rPr>
+        <w:t xml:space="preserve">• </w:t>
+      </w:r>
+      <w:r>
+        <w:rPr>
+          <w:rFonts w:ascii="Calibri" w:hAnsi="Calibri"/>
+          <w:sz w:val="21"/>
+        </w:rPr>
+        <w:t>Crosscultural, Language, and Academic Development (CLAD) Certification — November 2006</w:t>
+      </w:r>
+    </w:p>
+    <w:p>
+      <w:pPr>
+        <w:spacing w:after="60" w:lineRule="auto" w:line="264"/>
+        <w:ind w:left="317" w:hanging="202"/>
+      </w:pPr>
+      <w:r>
+        <w:rPr>
+          <w:rFonts w:ascii="Calibri" w:hAnsi="Calibri"/>
+          <w:sz w:val="21"/>
+        </w:rPr>
+        <w:t xml:space="preserve">• </w:t>
+      </w:r>
+      <w:r>
+        <w:rPr>
+          <w:rFonts w:ascii="Calibri" w:hAnsi="Calibri"/>
+          <w:sz w:val="21"/>
+        </w:rPr>
+        <w:t>International Baccalaureate Primary Years Programme (IB PYP) Certification — March 2007</w:t>
       </w:r>
     </w:p>
     <w:sectPr>

</xml_diff>

<commit_message>
Adding the certification to the JSON (position 2 in the list) and regenerating the PDF to verify the two-page layout.
</commit_message>
<xml_diff>
--- a/outputs/executive_snapshot.docx
+++ b/outputs/executive_snapshot.docx
@@ -396,6 +396,26 @@
           <w:rFonts w:ascii="Calibri" w:hAnsi="Calibri"/>
           <w:sz w:val="21"/>
         </w:rPr>
+        <w:t>Autism Authorization — Education Specialist Instruction Credential, California — 2021</w:t>
+      </w:r>
+    </w:p>
+    <w:p>
+      <w:pPr>
+        <w:spacing w:after="60" w:lineRule="auto" w:line="264"/>
+        <w:ind w:left="317" w:hanging="202"/>
+      </w:pPr>
+      <w:r>
+        <w:rPr>
+          <w:rFonts w:ascii="Calibri" w:hAnsi="Calibri"/>
+          <w:sz w:val="21"/>
+        </w:rPr>
+        <w:t xml:space="preserve">• </w:t>
+      </w:r>
+      <w:r>
+        <w:rPr>
+          <w:rFonts w:ascii="Calibri" w:hAnsi="Calibri"/>
+          <w:sz w:val="21"/>
+        </w:rPr>
         <w:t>Clear Multiple Subject Teaching Credential, California — Renewed January 2021</w:t>
       </w:r>
     </w:p>

</xml_diff>

<commit_message>
hat matches the same pattern as the others and renders as: Crisis Prevention Institute (CPI) — Nonviolent Crisis Intervention (NCI) Certification — March 2018 (em dash between credential line and date in PDFs/markdown). No internal codes (nothing like NCI3A07CBA was added). meta.last_updated → 2026-04-16 for
</commit_message>
<xml_diff>
--- a/outputs/executive_snapshot.docx
+++ b/outputs/executive_snapshot.docx
@@ -436,6 +436,26 @@
           <w:rFonts w:ascii="Calibri" w:hAnsi="Calibri"/>
           <w:sz w:val="21"/>
         </w:rPr>
+        <w:t>Crisis Prevention Institute (CPI) — Nonviolent Crisis Intervention (NCI) Certification — March 2018</w:t>
+      </w:r>
+    </w:p>
+    <w:p>
+      <w:pPr>
+        <w:spacing w:after="60" w:lineRule="auto" w:line="264"/>
+        <w:ind w:left="317" w:hanging="202"/>
+      </w:pPr>
+      <w:r>
+        <w:rPr>
+          <w:rFonts w:ascii="Calibri" w:hAnsi="Calibri"/>
+          <w:sz w:val="21"/>
+        </w:rPr>
+        <w:t xml:space="preserve">• </w:t>
+      </w:r>
+      <w:r>
+        <w:rPr>
+          <w:rFonts w:ascii="Calibri" w:hAnsi="Calibri"/>
+          <w:sz w:val="21"/>
+        </w:rPr>
         <w:t>Crosscultural, Language, and Academic Development (CLAD) Certification — November 2006</w:t>
       </w:r>
     </w:p>

</xml_diff>

<commit_message>
I’ll evaluate the three options against the current resume structure and then implement the least disruptive fix that removes “gap/step-down” perception while staying transparent about volunteer status.
</commit_message>
<xml_diff>
--- a/outputs/executive_snapshot.docx
+++ b/outputs/executive_snapshot.docx
@@ -178,7 +178,7 @@
           <w:rFonts w:ascii="Calibri" w:hAnsi="Calibri"/>
           <w:sz w:val="21"/>
         </w:rPr>
-        <w:t>Mission Hills Junior High English: Guided a reader from avoidance through two years of growing engagement into high-school novel electives. The student later described this stretch as the point they became willing to try (privacy-safe).</w:t>
+        <w:t>Mission Hills Junior High English: A student moved from active reading avoidance to choosing high-school novel electives after two years of scaffolded wins. Years later, the student described that stretch as the turning point in being willing to try (privacy-safe).</w:t>
       </w:r>
     </w:p>
     <w:p>
@@ -271,7 +271,7 @@
           <w:rFonts w:ascii="Calibri" w:hAnsi="Calibri"/>
           <w:sz w:val="21"/>
         </w:rPr>
-        <w:t>Elementary Classroom &amp; Special Education Support (Volunteer) | Capistrano Unified School District, Riley Elementary | Capistrano Valley, CA | June 2013 – March 2016</w:t>
+        <w:t>Elementary Classroom &amp; Special Education Support (Volunteer role) | Capistrano Unified School District, Riley Elementary | Capistrano Valley, CA | June 2013 – March 2016</w:t>
       </w:r>
     </w:p>
     <w:p>

</xml_diff>